<commit_message>
final report version 2.0
</commit_message>
<xml_diff>
--- a/for final report/צריך להיות בדוח פרויקט/ניתוח התוצאות מנוסח מחדש.docx
+++ b/for final report/צריך להיות בדוח פרויקט/ניתוח התוצאות מנוסח מחדש.docx
@@ -2,6 +2,82 @@
 <file path=word/document.xml><?xml version="1.0" encoding="utf-8"?>
 <w:document xmlns:wpc="http://schemas.microsoft.com/office/word/2010/wordprocessingCanvas" xmlns:cx="http://schemas.microsoft.com/office/drawing/2014/chartex" xmlns:cx1="http://schemas.microsoft.com/office/drawing/2015/9/8/chartex" xmlns:cx2="http://schemas.microsoft.com/office/drawing/2015/10/21/chartex" xmlns:cx3="http://schemas.microsoft.com/office/drawing/2016/5/9/chartex" xmlns:cx4="http://schemas.microsoft.com/office/drawing/2016/5/10/chartex" xmlns:cx5="http://schemas.microsoft.com/office/drawing/2016/5/11/chartex" xmlns:cx6="http://schemas.microsoft.com/office/drawing/2016/5/12/chartex" xmlns:cx7="http://schemas.microsoft.com/office/drawing/2016/5/13/chartex" xmlns:cx8="http://schemas.microsoft.com/office/drawing/2016/5/14/chartex" xmlns:mc="http://schemas.openxmlformats.org/markup-compatibility/2006" xmlns:aink="http://schemas.microsoft.com/office/drawing/2016/ink" xmlns:am3d="http://schemas.microsoft.com/office/drawing/2017/model3d" xmlns:o="urn:schemas-microsoft-com:office:office" xmlns:oel="http://schemas.microsoft.com/office/2019/extlst" xmlns:r="http://schemas.openxmlformats.org/officeDocument/2006/relationships" xmlns:m="http://schemas.openxmlformats.org/officeDocument/2006/math" xmlns:v="urn:schemas-microsoft-com:vml" xmlns:wp14="http://schemas.microsoft.com/office/word/2010/wordprocessingDrawing" xmlns:wp="http://schemas.openxmlformats.org/drawingml/2006/wordprocessingDrawing" xmlns:w10="urn:schemas-microsoft-com:office:word" xmlns:w="http://schemas.openxmlformats.org/wordprocessingml/2006/main" xmlns:w14="http://schemas.microsoft.com/office/word/2010/wordml" xmlns:w15="http://schemas.microsoft.com/office/word/2012/wordml" xmlns:w16cei="http://schemas.microsoft.com/office/word/2026/wordml/cei" xmlns:w16cex="http://schemas.microsoft.com/office/word/2018/wordml/cex" xmlns:w16cid="http://schemas.microsoft.com/office/word/2016/wordml/cid" xmlns:w16="http://schemas.microsoft.com/office/word/2018/wordml" xmlns:w16du="http://schemas.microsoft.com/office/word/2023/wordml/word16du" xmlns:w16sdtdh="http://schemas.microsoft.com/office/word/2020/wordml/sdtdatahash" xmlns:w16sdtfl="http://schemas.microsoft.com/office/word/2024/wordml/sdtformatlock" xmlns:w16se="http://schemas.microsoft.com/office/word/2015/wordml/symex" xmlns:wpg="http://schemas.microsoft.com/office/word/2010/wordprocessingGroup" xmlns:wpi="http://schemas.microsoft.com/office/word/2010/wordprocessingInk" xmlns:wne="http://schemas.microsoft.com/office/word/2006/wordml" xmlns:wps="http://schemas.microsoft.com/office/word/2010/wordprocessingShape" mc:Ignorable="w14 w15 w16se w16cid w16 w16cex w16sdtdh w16sdtfl w16du wp14">
   <w:body>
+    <w:p>
+      <w:pPr>
+        <w:spacing w:before="2000" w:after="400"/>
+        <w:jc w:val="center"/>
+      </w:pPr>
+      <w:r>
+        <w:rPr>
+          <w:rFonts w:hint="cs"/>
+          <w:b/>
+          <w:bCs/>
+          <w:sz w:val="34"/>
+          <w:szCs w:val="34"/>
+          <w:rtl/>
+        </w:rPr>
+        <w:t xml:space="preserve">ניתוח תוצאות </w:t>
+      </w:r>
+      <w:r>
+        <w:rPr>
+          <w:b/>
+          <w:bCs/>
+          <w:sz w:val="34"/>
+          <w:szCs w:val="34"/>
+        </w:rPr>
+        <w:t xml:space="preserve"> </w:t>
+      </w:r>
+      <w:r>
+        <w:rPr>
+          <w:rFonts w:hint="cs"/>
+          <w:b/>
+          <w:bCs/>
+          <w:sz w:val="34"/>
+          <w:szCs w:val="34"/>
+          <w:rtl/>
+        </w:rPr>
+        <w:t xml:space="preserve">עבור מסווגי </w:t>
+      </w:r>
+      <w:r>
+        <w:rPr>
+          <w:b/>
+          <w:bCs/>
+          <w:sz w:val="34"/>
+          <w:szCs w:val="34"/>
+        </w:rPr>
+        <w:t>למידת מכונה ו</w:t>
+      </w:r>
+      <w:r>
+        <w:rPr>
+          <w:rFonts w:hint="cs"/>
+          <w:b/>
+          <w:bCs/>
+          <w:sz w:val="34"/>
+          <w:szCs w:val="34"/>
+          <w:rtl/>
+        </w:rPr>
+        <w:t>מסווגי</w:t>
+      </w:r>
+      <w:r>
+        <w:rPr>
+          <w:b/>
+          <w:bCs/>
+          <w:sz w:val="34"/>
+          <w:szCs w:val="34"/>
+        </w:rPr>
+        <w:t>למידה עמוקה</w:t>
+      </w:r>
+    </w:p>
+    <w:p>
+      <w:pPr>
+        <w:pStyle w:val="Heading1"/>
+        <w:spacing w:before="300" w:after="150"/>
+        <w:rPr>
+          <w:rFonts w:ascii="David" w:eastAsia="David" w:hAnsi="David" w:cs="David"/>
+          <w:rtl/>
+        </w:rPr>
+      </w:pPr>
+    </w:p>
     <w:p>
       <w:pPr>
         <w:pStyle w:val="Heading1"/>
@@ -271,6 +347,7 @@
           <w:rFonts w:ascii="David" w:eastAsia="David" w:hAnsi="David" w:cs="David" w:hint="cs"/>
           <w:rtl/>
         </w:rPr>
+        <w:lastRenderedPageBreak/>
         <w:t>או</w:t>
       </w:r>
       <w:r>
@@ -432,7 +509,6 @@
           <w:rFonts w:ascii="David" w:eastAsia="David" w:hAnsi="David" w:cs="David"/>
           <w:rtl/>
         </w:rPr>
-        <w:lastRenderedPageBreak/>
         <w:t>כדי להגיע ל-5% העליונים של מרחב הפרמטרים בהסתברות 95%, נדרשות כ-60 איטרציות</w:t>
       </w:r>
       <w:r>
@@ -1020,6 +1096,7 @@
           <w:bCs/>
           <w:rtl/>
         </w:rPr>
+        <w:lastRenderedPageBreak/>
         <w:t>יעילות חישובית גבוהה</w:t>
       </w:r>
       <w:r>
@@ -1567,6 +1644,9 @@
         </w:numPr>
         <w:spacing w:after="90" w:line="280" w:lineRule="auto"/>
         <w:contextualSpacing w:val="0"/>
+        <w:rPr>
+          <w:rtl/>
+        </w:rPr>
       </w:pPr>
       <w:r>
         <w:rPr>
@@ -1574,6 +1654,57 @@
           <w:rtl/>
         </w:rPr>
         <w:t>מעבר מנרמול לפי שיא (Peak) לנרמול לפי עוצמה ממוצעת (RMS Normalization).</w:t>
+      </w:r>
+    </w:p>
+    <w:p>
+      <w:pPr>
+        <w:rPr>
+          <w:rFonts w:ascii="David" w:hAnsi="David" w:cs="David"/>
+          <w:b/>
+          <w:bCs/>
+          <w:sz w:val="40"/>
+          <w:szCs w:val="40"/>
+          <w:u w:val="single"/>
+          <w:rtl/>
+        </w:rPr>
+      </w:pPr>
+      <w:r>
+        <w:rPr>
+          <w:rFonts w:ascii="David" w:hAnsi="David" w:cs="David"/>
+          <w:b/>
+          <w:bCs/>
+          <w:sz w:val="40"/>
+          <w:szCs w:val="40"/>
+          <w:u w:val="single"/>
+          <w:rtl/>
+        </w:rPr>
+        <w:lastRenderedPageBreak/>
+        <w:t xml:space="preserve">תוצאות </w:t>
+      </w:r>
+    </w:p>
+    <w:p>
+      <w:pPr>
+        <w:rPr>
+          <w:rFonts w:ascii="David" w:hAnsi="David" w:cs="David"/>
+          <w:b/>
+          <w:bCs/>
+          <w:sz w:val="28"/>
+          <w:szCs w:val="28"/>
+          <w:u w:val="single"/>
+          <w:rtl/>
+        </w:rPr>
+      </w:pPr>
+      <w:r>
+        <w:rPr>
+          <w:rFonts w:ascii="David" w:hAnsi="David" w:cs="David" w:hint="cs"/>
+          <w:b/>
+          <w:bCs/>
+          <w:sz w:val="28"/>
+          <w:szCs w:val="28"/>
+          <w:u w:val="single"/>
+          <w:rtl/>
+        </w:rPr>
+        <w:t>ננתח את התוצאות בשני חלקים עבור מסווגי למידת מכונה ועבור מסווגי למידה עמוקה</w:t>
       </w:r>
     </w:p>
     <w:p>
@@ -1588,11 +1719,9 @@
           <w:rtl/>
         </w:rPr>
       </w:pPr>
-    </w:p>
-    <w:p>
-      <w:pPr>
-        <w:rPr>
-          <w:rFonts w:ascii="David" w:hAnsi="David" w:cs="David"/>
+      <w:r>
+        <w:rPr>
+          <w:rFonts w:ascii="David" w:hAnsi="David" w:cs="David" w:hint="cs"/>
           <w:b/>
           <w:bCs/>
           <w:sz w:val="36"/>
@@ -1600,10 +1729,9 @@
           <w:u w:val="single"/>
           <w:rtl/>
         </w:rPr>
-      </w:pPr>
-    </w:p>
-    <w:p>
-      <w:pPr>
+        <w:t xml:space="preserve">חלק א' </w:t>
+      </w:r>
+      <w:r>
         <w:rPr>
           <w:rFonts w:ascii="David" w:hAnsi="David" w:cs="David"/>
           <w:b/>
@@ -1613,12 +1741,11 @@
           <w:u w:val="single"/>
           <w:rtl/>
         </w:rPr>
-      </w:pPr>
-    </w:p>
-    <w:p>
-      <w:pPr>
-        <w:rPr>
-          <w:rFonts w:ascii="David" w:hAnsi="David" w:cs="David"/>
+        <w:t>–</w:t>
+      </w:r>
+      <w:r>
+        <w:rPr>
+          <w:rFonts w:ascii="David" w:hAnsi="David" w:cs="David" w:hint="cs"/>
           <w:b/>
           <w:bCs/>
           <w:sz w:val="36"/>
@@ -1626,82 +1753,7 @@
           <w:u w:val="single"/>
           <w:rtl/>
         </w:rPr>
-      </w:pPr>
-    </w:p>
-    <w:p>
-      <w:pPr>
-        <w:rPr>
-          <w:rFonts w:ascii="David" w:hAnsi="David" w:cs="David"/>
-          <w:b/>
-          <w:bCs/>
-          <w:sz w:val="36"/>
-          <w:szCs w:val="36"/>
-          <w:u w:val="single"/>
-          <w:rtl/>
-        </w:rPr>
-      </w:pPr>
-    </w:p>
-    <w:p>
-      <w:pPr>
-        <w:rPr>
-          <w:rFonts w:ascii="David" w:hAnsi="David" w:cs="David"/>
-          <w:b/>
-          <w:bCs/>
-          <w:sz w:val="36"/>
-          <w:szCs w:val="36"/>
-          <w:u w:val="single"/>
-          <w:rtl/>
-        </w:rPr>
-      </w:pPr>
-    </w:p>
-    <w:p>
-      <w:pPr>
-        <w:rPr>
-          <w:rFonts w:ascii="David" w:hAnsi="David" w:cs="David"/>
-          <w:b/>
-          <w:bCs/>
-          <w:sz w:val="36"/>
-          <w:szCs w:val="36"/>
-          <w:u w:val="single"/>
-          <w:rtl/>
-        </w:rPr>
-      </w:pPr>
-    </w:p>
-    <w:p>
-      <w:pPr>
-        <w:rPr>
-          <w:rFonts w:ascii="David" w:hAnsi="David" w:cs="David"/>
-          <w:b/>
-          <w:bCs/>
-          <w:sz w:val="36"/>
-          <w:szCs w:val="36"/>
-          <w:u w:val="single"/>
-          <w:rtl/>
-        </w:rPr>
-      </w:pPr>
-      <w:r>
-        <w:rPr>
-          <w:rFonts w:ascii="David" w:hAnsi="David" w:cs="David"/>
-          <w:b/>
-          <w:bCs/>
-          <w:sz w:val="36"/>
-          <w:szCs w:val="36"/>
-          <w:u w:val="single"/>
-          <w:rtl/>
-        </w:rPr>
-        <w:t xml:space="preserve">תוצאות </w:t>
-      </w:r>
-      <w:r>
-        <w:rPr>
-          <w:rFonts w:ascii="David" w:hAnsi="David" w:cs="David" w:hint="cs"/>
-          <w:b/>
-          <w:bCs/>
-          <w:sz w:val="36"/>
-          <w:szCs w:val="36"/>
-          <w:u w:val="single"/>
-          <w:rtl/>
-        </w:rPr>
-        <w:t>:</w:t>
+        <w:t xml:space="preserve"> תוצאות מסווגי למידת מגונה</w:t>
       </w:r>
     </w:p>
     <w:p>
@@ -13043,7 +13095,7 @@
           <w:rFonts w:ascii="David" w:hAnsi="David" w:cs="David"/>
           <w:rtl/>
         </w:rPr>
-        <w:t xml:space="preserve"> משמש בפרויקט ככלי אובייקטיבי מרכזי להערכת האיכות האקוסטית של מאגרי השמע השונים, והוא מחושב בדציבלים (</w:t>
+        <w:t xml:space="preserve"> משמש בפרויקט ככלי להערכת האיכות האקוסטית של מאגרי השמע השונים, והוא מחושב בדציבלים (</w:t>
       </w:r>
       <w:r>
         <w:rPr>
@@ -13244,20 +13296,7 @@
           <w:rFonts w:ascii="David" w:hAnsi="David" w:cs="David"/>
           <w:rtl/>
         </w:rPr>
-        <w:t>חשוב להבהיר כי סקריפט הנרמול מטפל בעוצמה (</w:t>
-      </w:r>
-      <w:r>
-        <w:rPr>
-          <w:rFonts w:ascii="David" w:hAnsi="David" w:cs="David"/>
-        </w:rPr>
-        <w:t>Volume</w:t>
-      </w:r>
-      <w:r>
-        <w:rPr>
-          <w:rFonts w:ascii="David" w:hAnsi="David" w:cs="David"/>
-          <w:rtl/>
-        </w:rPr>
-        <w:t>) וברעשי רקע סטטיים, אך אינו יכול לשנות את החומרה הפיזית או את הדחיסה של המקור. אם ה-</w:t>
+        <w:t>חשוב להבהיר כי סקריפט הנרמול מטפל בעוצמה  וברעשי רקע סטטיים, אך אינו יכול לשנות את החומרה הפיזית או את הדחיסה של המקור. אם ה-</w:t>
       </w:r>
       <w:r>
         <w:rPr>
@@ -14962,7 +15001,14 @@
           <w:rFonts w:ascii="David" w:hAnsi="David" w:cs="David" w:hint="cs"/>
           <w:rtl/>
         </w:rPr>
-        <w:t xml:space="preserve">ניתן לראות מההתפלגות כי המבטא הסיני והניגרי יותר מובחנים וקלים לפיצול ע"י המאגרים השונים בעזרת הפפיצ'רים שברשותנו אך המבטא האמריקאי וההודי יותר מעורבבים ביניהם ומכאן </w:t>
+        <w:t xml:space="preserve">ניתן לראות מההתפלגות כי המבטא הסיני והניגרי יותר מובחנים וקלים לפיצול ע"י המאגרים השונים בעזרת הפיצ'רים שברשותנו אך המבטא האמריקאי וההודי יותר מעורבבים ביניהם </w:t>
+      </w:r>
+      <w:r>
+        <w:rPr>
+          <w:rFonts w:ascii="David" w:hAnsi="David" w:cs="David" w:hint="cs"/>
+          <w:rtl/>
+        </w:rPr>
+        <w:t xml:space="preserve">מה שמסביר את את מטריצת הבלבול. </w:t>
       </w:r>
     </w:p>
     <w:p>
@@ -16437,40 +16483,57 @@
       <w:pPr>
         <w:rPr>
           <w:rFonts w:ascii="David" w:hAnsi="David" w:cs="David"/>
-          <w:rtl/>
-        </w:rPr>
-      </w:pPr>
-    </w:p>
-    <w:p>
-      <w:pPr>
-        <w:rPr>
-          <w:rFonts w:ascii="David" w:hAnsi="David" w:cs="David"/>
-          <w:rtl/>
-        </w:rPr>
-      </w:pPr>
-    </w:p>
-    <w:p>
-      <w:pPr>
-        <w:rPr>
-          <w:rFonts w:ascii="David" w:hAnsi="David" w:cs="David"/>
-          <w:b/>
-          <w:bCs/>
-          <w:sz w:val="56"/>
-          <w:szCs w:val="56"/>
+          <w:b/>
+          <w:bCs/>
+          <w:sz w:val="40"/>
+          <w:szCs w:val="40"/>
           <w:u w:val="single"/>
           <w:rtl/>
         </w:rPr>
       </w:pPr>
       <w:r>
         <w:rPr>
-          <w:rFonts w:ascii="David" w:hAnsi="David" w:cs="David"/>
-          <w:b/>
-          <w:bCs/>
-          <w:sz w:val="56"/>
-          <w:szCs w:val="56"/>
+          <w:rFonts w:ascii="David" w:hAnsi="David" w:cs="David" w:hint="cs"/>
+          <w:b/>
+          <w:bCs/>
+          <w:sz w:val="40"/>
+          <w:szCs w:val="40"/>
           <w:u w:val="single"/>
           <w:rtl/>
         </w:rPr>
+        <w:t>חלק ב'- ניתוח תוצאות מסווגי למידה עמוקה</w:t>
+      </w:r>
+    </w:p>
+    <w:p>
+      <w:pPr>
+        <w:rPr>
+          <w:rFonts w:ascii="David" w:hAnsi="David" w:cs="David"/>
+          <w:rtl/>
+        </w:rPr>
+      </w:pPr>
+    </w:p>
+    <w:p>
+      <w:pPr>
+        <w:rPr>
+          <w:rFonts w:ascii="David" w:hAnsi="David" w:cs="David"/>
+          <w:b/>
+          <w:bCs/>
+          <w:sz w:val="32"/>
+          <w:szCs w:val="32"/>
+          <w:u w:val="single"/>
+          <w:rtl/>
+        </w:rPr>
+      </w:pPr>
+      <w:r>
+        <w:rPr>
+          <w:rFonts w:ascii="David" w:hAnsi="David" w:cs="David"/>
+          <w:b/>
+          <w:bCs/>
+          <w:sz w:val="32"/>
+          <w:szCs w:val="32"/>
+          <w:u w:val="single"/>
+          <w:rtl/>
+        </w:rPr>
         <w:t xml:space="preserve">הרצת </w:t>
       </w:r>
       <w:r>
@@ -16478,8 +16541,8 @@
           <w:rFonts w:ascii="David" w:hAnsi="David" w:cs="David" w:hint="cs"/>
           <w:b/>
           <w:bCs/>
-          <w:sz w:val="56"/>
-          <w:szCs w:val="56"/>
+          <w:sz w:val="32"/>
+          <w:szCs w:val="32"/>
           <w:u w:val="single"/>
           <w:rtl/>
         </w:rPr>
@@ -16490,8 +16553,8 @@
           <w:rFonts w:ascii="David" w:hAnsi="David" w:cs="David"/>
           <w:b/>
           <w:bCs/>
-          <w:sz w:val="56"/>
-          <w:szCs w:val="56"/>
+          <w:sz w:val="32"/>
+          <w:szCs w:val="32"/>
           <w:u w:val="single"/>
           <w:rtl/>
         </w:rPr>
@@ -16502,8 +16565,8 @@
           <w:rFonts w:ascii="David" w:hAnsi="David" w:cs="David"/>
           <w:b/>
           <w:bCs/>
-          <w:sz w:val="56"/>
-          <w:szCs w:val="56"/>
+          <w:sz w:val="32"/>
+          <w:szCs w:val="32"/>
           <w:u w:val="single"/>
         </w:rPr>
         <w:t>CNN</w:t>
@@ -16971,39 +17034,39 @@
           <w:bCs/>
           <w:rtl/>
         </w:rPr>
+        <w:t>3.1</w:t>
+      </w:r>
+      <w:r>
+        <w:rPr>
+          <w:rFonts w:ascii="David" w:hAnsi="David" w:cs="David"/>
+          <w:b/>
+          <w:bCs/>
+          <w:rtl/>
+        </w:rPr>
+        <w:t xml:space="preserve">. ארכיטקטורת הרשת והרצה בסביבת </w:t>
+      </w:r>
+      <w:r>
+        <w:rPr>
+          <w:rFonts w:ascii="David" w:hAnsi="David" w:cs="David"/>
+          <w:b/>
+          <w:bCs/>
+        </w:rPr>
+        <w:t>Kaggle</w:t>
+      </w:r>
+    </w:p>
+    <w:p>
+      <w:pPr>
+        <w:rPr>
+          <w:rFonts w:ascii="David" w:hAnsi="David" w:cs="David"/>
+          <w:rtl/>
+        </w:rPr>
+      </w:pPr>
+      <w:r>
+        <w:rPr>
+          <w:rFonts w:ascii="David" w:hAnsi="David" w:cs="David"/>
+          <w:rtl/>
+        </w:rPr>
         <w:lastRenderedPageBreak/>
-        <w:t>3.1</w:t>
-      </w:r>
-      <w:r>
-        <w:rPr>
-          <w:rFonts w:ascii="David" w:hAnsi="David" w:cs="David"/>
-          <w:b/>
-          <w:bCs/>
-          <w:rtl/>
-        </w:rPr>
-        <w:t xml:space="preserve">. ארכיטקטורת הרשת והרצה בסביבת </w:t>
-      </w:r>
-      <w:r>
-        <w:rPr>
-          <w:rFonts w:ascii="David" w:hAnsi="David" w:cs="David"/>
-          <w:b/>
-          <w:bCs/>
-        </w:rPr>
-        <w:t>Kaggle</w:t>
-      </w:r>
-    </w:p>
-    <w:p>
-      <w:pPr>
-        <w:rPr>
-          <w:rFonts w:ascii="David" w:hAnsi="David" w:cs="David"/>
-          <w:rtl/>
-        </w:rPr>
-      </w:pPr>
-      <w:r>
-        <w:rPr>
-          <w:rFonts w:ascii="David" w:hAnsi="David" w:cs="David"/>
-          <w:rtl/>
-        </w:rPr>
         <w:t xml:space="preserve">הניסויים הורצו בסביבת הענן של </w:t>
       </w:r>
       <w:r>
@@ -18055,6 +18118,7 @@
         <w:rPr>
           <w:noProof/>
         </w:rPr>
+        <w:lastRenderedPageBreak/>
         <w:drawing>
           <wp:anchor distT="0" distB="0" distL="114300" distR="114300" simplePos="0" relativeHeight="251662336" behindDoc="0" locked="0" layoutInCell="1" allowOverlap="1" wp14:anchorId="0EEC32DB" wp14:editId="25A6C2B1">
             <wp:simplePos x="0" y="0"/>
@@ -18330,6 +18394,7 @@
           <w:rFonts w:ascii="David" w:hAnsi="David" w:cs="David"/>
           <w:b/>
           <w:bCs/>
+          <w:noProof/>
           <w:sz w:val="36"/>
           <w:szCs w:val="36"/>
           <w:u w:val="single"/>
@@ -18475,6 +18540,7 @@
           <w:rFonts w:ascii="David" w:hAnsi="David" w:cs="David"/>
           <w:b/>
           <w:bCs/>
+          <w:noProof/>
           <w:sz w:val="36"/>
           <w:szCs w:val="36"/>
           <w:u w:val="single"/>
@@ -18593,7 +18659,7 @@
     <w:p>
       <w:pPr>
         <w:rPr>
-          <w:rFonts w:ascii="David" w:hAnsi="David" w:cs="David" w:hint="cs"/>
+          <w:rFonts w:ascii="David" w:hAnsi="David" w:cs="David"/>
           <w:b/>
           <w:bCs/>
           <w:sz w:val="36"/>
@@ -18632,7 +18698,62 @@
     <w:p>
       <w:pPr>
         <w:rPr>
+          <w:rFonts w:ascii="David" w:hAnsi="David" w:cs="David"/>
+          <w:sz w:val="24"/>
+          <w:szCs w:val="24"/>
+          <w:rtl/>
+        </w:rPr>
+      </w:pPr>
+    </w:p>
+    <w:p>
+      <w:pPr>
+        <w:rPr>
+          <w:rFonts w:ascii="David" w:hAnsi="David" w:cs="David"/>
+          <w:sz w:val="24"/>
+          <w:szCs w:val="24"/>
+          <w:rtl/>
+        </w:rPr>
+      </w:pPr>
+      <w:r>
+        <w:rPr>
           <w:rFonts w:ascii="David" w:hAnsi="David" w:cs="David" w:hint="cs"/>
+          <w:sz w:val="24"/>
+          <w:szCs w:val="24"/>
+          <w:rtl/>
+        </w:rPr>
+        <w:t xml:space="preserve">-לא הלכנו על </w:t>
+      </w:r>
+      <w:r>
+        <w:rPr>
+          <w:rFonts w:ascii="David" w:hAnsi="David" w:cs="David"/>
+          <w:sz w:val="24"/>
+          <w:szCs w:val="24"/>
+        </w:rPr>
+        <w:t>CNN</w:t>
+      </w:r>
+      <w:r>
+        <w:rPr>
+          <w:rFonts w:ascii="David" w:hAnsi="David" w:cs="David" w:hint="cs"/>
+          <w:sz w:val="24"/>
+          <w:szCs w:val="24"/>
+          <w:rtl/>
+        </w:rPr>
+        <w:t xml:space="preserve"> משולב כי זה אותם ערכים לכולם</w:t>
+      </w:r>
+      <w:r>
+        <w:rPr>
+          <w:rFonts w:ascii="David" w:hAnsi="David" w:cs="David" w:hint="cs"/>
+          <w:sz w:val="24"/>
+          <w:szCs w:val="24"/>
+          <w:rtl/>
+        </w:rPr>
+        <w:t xml:space="preserve"> בוקטור הפונטי</w:t>
+      </w:r>
+    </w:p>
+    <w:p>
+      <w:pPr>
+        <w:rPr>
+          <w:rFonts w:ascii="David" w:hAnsi="David" w:cs="David"/>
           <w:b/>
           <w:bCs/>
           <w:sz w:val="36"/>
@@ -18643,7 +18764,7 @@
       </w:pPr>
       <w:r>
         <w:rPr>
-          <w:rFonts w:ascii="David" w:hAnsi="David" w:cs="David" w:hint="cs"/>
+          <w:rFonts w:ascii="David" w:hAnsi="David" w:cs="David"/>
           <w:b/>
           <w:bCs/>
           <w:sz w:val="36"/>
@@ -18651,7 +18772,7 @@
           <w:u w:val="single"/>
           <w:rtl/>
         </w:rPr>
-        <w:t xml:space="preserve">-לא הלכנו על </w:t>
+        <w:t>הסבר תוצאות ה-</w:t>
       </w:r>
       <w:r>
         <w:rPr>
@@ -18666,7 +18787,7 @@
       </w:r>
       <w:r>
         <w:rPr>
-          <w:rFonts w:ascii="David" w:hAnsi="David" w:cs="David" w:hint="cs"/>
+          <w:rFonts w:ascii="David" w:hAnsi="David" w:cs="David"/>
           <w:b/>
           <w:bCs/>
           <w:sz w:val="36"/>
@@ -18674,67 +18795,292 @@
           <w:u w:val="single"/>
           <w:rtl/>
         </w:rPr>
-        <w:t xml:space="preserve"> משולב כי זה אותם ערכים לכולם</w:t>
-      </w:r>
-      <w:r>
-        <w:rPr>
-          <w:rFonts w:ascii="David" w:hAnsi="David" w:cs="David" w:hint="cs"/>
-          <w:b/>
-          <w:bCs/>
+        <w:t>:</w:t>
+      </w:r>
+    </w:p>
+    <w:p>
+      <w:pPr>
+        <w:rPr>
+          <w:rFonts w:ascii="David" w:hAnsi="David" w:cs="David"/>
+          <w:b/>
+          <w:bCs/>
+          <w:color w:val="EE0000"/>
           <w:sz w:val="36"/>
           <w:szCs w:val="36"/>
           <w:u w:val="single"/>
           <w:rtl/>
         </w:rPr>
-        <w:t xml:space="preserve"> בוקטור הפונטי</w:t>
-      </w:r>
-    </w:p>
-    <w:p>
-      <w:pPr>
-        <w:rPr>
-          <w:rFonts w:ascii="David" w:hAnsi="David" w:cs="David"/>
-          <w:b/>
-          <w:bCs/>
+      </w:pPr>
+      <w:r>
+        <w:rPr>
+          <w:rFonts w:ascii="David" w:hAnsi="David" w:cs="David" w:hint="cs"/>
+          <w:b/>
+          <w:bCs/>
+          <w:color w:val="EE0000"/>
           <w:sz w:val="36"/>
           <w:szCs w:val="36"/>
           <w:u w:val="single"/>
           <w:rtl/>
         </w:rPr>
-      </w:pPr>
-      <w:r>
-        <w:rPr>
-          <w:rFonts w:ascii="David" w:hAnsi="David" w:cs="David"/>
-          <w:b/>
-          <w:bCs/>
+        <w:t>ללכת ל</w:t>
+      </w:r>
+      <w:r>
+        <w:rPr>
+          <w:rFonts w:ascii="David" w:hAnsi="David" w:cs="David"/>
+          <w:b/>
+          <w:bCs/>
+          <w:color w:val="EE0000"/>
           <w:sz w:val="36"/>
           <w:szCs w:val="36"/>
           <w:u w:val="single"/>
-          <w:rtl/>
-        </w:rPr>
-        <w:t>הסבר תוצאות ה-</w:t>
-      </w:r>
-      <w:r>
-        <w:rPr>
-          <w:rFonts w:ascii="David" w:hAnsi="David" w:cs="David"/>
-          <w:b/>
-          <w:bCs/>
+        </w:rPr>
+        <w:t xml:space="preserve">notebook KLM </w:t>
+      </w:r>
+      <w:r>
+        <w:rPr>
+          <w:rFonts w:ascii="David" w:hAnsi="David" w:cs="David" w:hint="cs"/>
+          <w:b/>
+          <w:bCs/>
+          <w:color w:val="EE0000"/>
           <w:sz w:val="36"/>
           <w:szCs w:val="36"/>
           <w:u w:val="single"/>
-        </w:rPr>
-        <w:t>CNN</w:t>
-      </w:r>
-      <w:r>
-        <w:rPr>
-          <w:rFonts w:ascii="David" w:hAnsi="David" w:cs="David"/>
-          <w:b/>
-          <w:bCs/>
+          <w:rtl/>
+        </w:rPr>
+        <w:t xml:space="preserve"> הישן שמסביר שם איך וקטור ה </w:t>
+      </w:r>
+      <w:r>
+        <w:rPr>
+          <w:rFonts w:ascii="David" w:hAnsi="David" w:cs="David"/>
+          <w:b/>
+          <w:bCs/>
+          <w:color w:val="EE0000"/>
           <w:sz w:val="36"/>
           <w:szCs w:val="36"/>
           <w:u w:val="single"/>
-          <w:rtl/>
-        </w:rPr>
-        <w:t>:</w:t>
+        </w:rPr>
+        <w:t xml:space="preserve">IPA </w:t>
+      </w:r>
+      <w:r>
+        <w:rPr>
+          <w:rFonts w:ascii="David" w:hAnsi="David" w:cs="David" w:hint="cs"/>
+          <w:b/>
+          <w:bCs/>
+          <w:color w:val="EE0000"/>
+          <w:sz w:val="36"/>
+          <w:szCs w:val="36"/>
+          <w:u w:val="single"/>
+          <w:rtl/>
+        </w:rPr>
+        <w:t xml:space="preserve"> נראה איך מוציאים קוד שמראה אילו חלקים בספטוגרמה עזרה לו לעשות הפרדה בין מבטאים , למה ה </w:t>
+      </w:r>
+      <w:r>
+        <w:rPr>
+          <w:rFonts w:ascii="David" w:hAnsi="David" w:cs="David"/>
+          <w:b/>
+          <w:bCs/>
+          <w:color w:val="EE0000"/>
+          <w:sz w:val="36"/>
+          <w:szCs w:val="36"/>
+          <w:u w:val="single"/>
+        </w:rPr>
+        <w:t>IPA</w:t>
+      </w:r>
+      <w:r>
+        <w:rPr>
+          <w:rFonts w:ascii="David" w:hAnsi="David" w:cs="David" w:hint="cs"/>
+          <w:b/>
+          <w:bCs/>
+          <w:color w:val="EE0000"/>
+          <w:sz w:val="36"/>
+          <w:szCs w:val="36"/>
+          <w:u w:val="single"/>
+          <w:rtl/>
+        </w:rPr>
+        <w:t xml:space="preserve"> עזר למרות שלמבטאים האלה יש את כל הצלילם ואיך ההבדלים בין המבטאים מתבטאים בספקטוגרמה (כתוב שם)</w:t>
+      </w:r>
+    </w:p>
+    <w:p>
+      <w:pPr>
+        <w:rPr>
+          <w:rFonts w:ascii="David" w:hAnsi="David" w:cs="David"/>
+          <w:b/>
+          <w:bCs/>
+          <w:color w:val="EE0000"/>
+          <w:sz w:val="36"/>
+          <w:szCs w:val="36"/>
+          <w:u w:val="single"/>
+          <w:rtl/>
+        </w:rPr>
+      </w:pPr>
+      <w:r>
+        <w:rPr>
+          <w:rFonts w:ascii="David" w:hAnsi="David" w:cs="David" w:hint="cs"/>
+          <w:b/>
+          <w:bCs/>
+          <w:color w:val="EE0000"/>
+          <w:sz w:val="36"/>
+          <w:szCs w:val="36"/>
+          <w:u w:val="single"/>
+          <w:rtl/>
+        </w:rPr>
+        <w:lastRenderedPageBreak/>
+        <w:t xml:space="preserve">לחפש אתר שמראה הבדלים בספקוגרמות וגלי קול כתוצאה של הבדלים קוליים כמו </w:t>
+      </w:r>
+      <w:r>
+        <w:rPr>
+          <w:rFonts w:ascii="David" w:hAnsi="David" w:cs="David"/>
+          <w:b/>
+          <w:bCs/>
+          <w:color w:val="EE0000"/>
+          <w:sz w:val="36"/>
+          <w:szCs w:val="36"/>
+          <w:u w:val="single"/>
+        </w:rPr>
+        <w:t xml:space="preserve">pitch timber </w:t>
+      </w:r>
+      <w:r>
+        <w:rPr>
+          <w:rFonts w:ascii="David" w:hAnsi="David" w:cs="David" w:hint="cs"/>
+          <w:b/>
+          <w:bCs/>
+          <w:color w:val="EE0000"/>
+          <w:sz w:val="36"/>
+          <w:szCs w:val="36"/>
+          <w:u w:val="single"/>
+          <w:rtl/>
+        </w:rPr>
+        <w:t xml:space="preserve"> ויכולת להגות צלילם מסוימים ולשים את זה גם בפרק המבוא</w:t>
+      </w:r>
+    </w:p>
+    <w:p>
+      <w:pPr>
+        <w:rPr>
+          <w:rFonts w:ascii="David" w:hAnsi="David" w:cs="David"/>
+          <w:b/>
+          <w:bCs/>
+          <w:color w:val="EE0000"/>
+          <w:sz w:val="36"/>
+          <w:szCs w:val="36"/>
+          <w:u w:val="single"/>
+          <w:rtl/>
+        </w:rPr>
+      </w:pPr>
+      <w:r>
+        <w:rPr>
+          <w:rFonts w:ascii="David" w:hAnsi="David" w:cs="David" w:hint="cs"/>
+          <w:b/>
+          <w:bCs/>
+          <w:color w:val="EE0000"/>
+          <w:sz w:val="36"/>
+          <w:szCs w:val="36"/>
+          <w:u w:val="single"/>
+          <w:rtl/>
+        </w:rPr>
+        <w:t>לחש</w:t>
+      </w:r>
+      <w:r>
+        <w:rPr>
+          <w:rFonts w:ascii="David" w:hAnsi="David" w:cs="David" w:hint="cs"/>
+          <w:b/>
+          <w:bCs/>
+          <w:color w:val="EE0000"/>
+          <w:sz w:val="36"/>
+          <w:szCs w:val="36"/>
+          <w:u w:val="single"/>
+          <w:rtl/>
+        </w:rPr>
+        <w:t>וב</w:t>
+      </w:r>
+      <w:r>
+        <w:rPr>
+          <w:rFonts w:ascii="David" w:hAnsi="David" w:cs="David" w:hint="cs"/>
+          <w:b/>
+          <w:bCs/>
+          <w:color w:val="EE0000"/>
+          <w:sz w:val="36"/>
+          <w:szCs w:val="36"/>
+          <w:u w:val="single"/>
+          <w:rtl/>
+        </w:rPr>
+        <w:t xml:space="preserve"> איך עושים הנדסה לאחור של הספקטוגרמה כדי להבין איל הוקטור הפונטי עזר לעומת לפני </w:t>
+      </w:r>
+    </w:p>
+    <w:p>
+      <w:pPr>
+        <w:rPr>
+          <w:rFonts w:ascii="David" w:hAnsi="David" w:cs="David"/>
+          <w:b/>
+          <w:bCs/>
+          <w:color w:val="EE0000"/>
+          <w:sz w:val="36"/>
+          <w:szCs w:val="36"/>
+          <w:u w:val="single"/>
+          <w:rtl/>
+        </w:rPr>
+      </w:pPr>
+      <w:r>
+        <w:rPr>
+          <w:rFonts w:ascii="David" w:hAnsi="David" w:cs="David" w:hint="cs"/>
+          <w:b/>
+          <w:bCs/>
+          <w:color w:val="EE0000"/>
+          <w:sz w:val="36"/>
+          <w:szCs w:val="36"/>
+          <w:u w:val="single"/>
+          <w:rtl/>
+        </w:rPr>
+        <w:t>לסהביר גם את ההבדלים ב</w:t>
+      </w:r>
+      <w:r>
+        <w:rPr>
+          <w:rFonts w:ascii="David" w:hAnsi="David" w:cs="David"/>
+          <w:b/>
+          <w:bCs/>
+          <w:color w:val="EE0000"/>
+          <w:sz w:val="36"/>
+          <w:szCs w:val="36"/>
+          <w:u w:val="single"/>
+        </w:rPr>
+        <w:t>conusion matrix</w:t>
+      </w:r>
+      <w:r>
+        <w:rPr>
+          <w:rFonts w:ascii="David" w:hAnsi="David" w:cs="David" w:hint="cs"/>
+          <w:b/>
+          <w:bCs/>
+          <w:color w:val="EE0000"/>
+          <w:sz w:val="36"/>
+          <w:szCs w:val="36"/>
+          <w:u w:val="single"/>
+          <w:rtl/>
+        </w:rPr>
+        <w:t xml:space="preserve"> ואיך ה </w:t>
+      </w:r>
+      <w:r>
+        <w:rPr>
+          <w:rFonts w:ascii="David" w:hAnsi="David" w:cs="David"/>
+          <w:b/>
+          <w:bCs/>
+          <w:color w:val="EE0000"/>
+          <w:sz w:val="36"/>
+          <w:szCs w:val="36"/>
+          <w:u w:val="single"/>
+        </w:rPr>
+        <w:t>CNN</w:t>
+      </w:r>
+      <w:r>
+        <w:rPr>
+          <w:rFonts w:ascii="David" w:hAnsi="David" w:cs="David" w:hint="cs"/>
+          <w:b/>
+          <w:bCs/>
+          <w:color w:val="EE0000"/>
+          <w:sz w:val="36"/>
+          <w:szCs w:val="36"/>
+          <w:u w:val="single"/>
+          <w:rtl/>
+        </w:rPr>
+        <w:t xml:space="preserve"> הדו שלבי עזר </w:t>
       </w:r>
     </w:p>
     <w:p>
@@ -18856,15 +19202,7 @@
           <w:rFonts w:ascii="David" w:hAnsi="David" w:cs="David"/>
           <w:rtl/>
         </w:rPr>
-        <w:t xml:space="preserve"> 6.62%), </w:t>
-      </w:r>
-      <w:r>
-        <w:rPr>
-          <w:rFonts w:ascii="David" w:hAnsi="David" w:cs="David"/>
-          <w:rtl/>
-        </w:rPr>
-        <w:lastRenderedPageBreak/>
-        <w:t>לצד עלייה במדד ה-</w:t>
+        <w:t xml:space="preserve"> 6.62%), לצד עלייה במדד ה-</w:t>
       </w:r>
       <w:r>
         <w:rPr>
@@ -19457,6 +19795,7 @@
           <w:rFonts w:ascii="David" w:eastAsia="David" w:hAnsi="David" w:cs="David"/>
           <w:rtl/>
         </w:rPr>
+        <w:lastRenderedPageBreak/>
         <w:t>סיכום</w:t>
       </w:r>
     </w:p>

</xml_diff>